<commit_message>
Added report and small changes
</commit_message>
<xml_diff>
--- a/Verslagen/Verslag31102025.docx
+++ b/Verslagen/Verslag31102025.docx
@@ -90,6 +90,1006 @@
       </w:pPr>
       <w:r>
         <w:t>Effecten van kleuren van knopen bekijken</w:t>
+      </w:r>
+    </w:p>
+    <w:p/>
+    <w:p/>
+    <w:p>
+      <w:r>
+        <w:t>Soorten te zien bij maximale kleuringen:</w:t>
+      </w:r>
+    </w:p>
+    <w:p>
+      <w:pPr>
+        <w:pStyle w:val="Lijstalinea"/>
+        <w:numPr>
+          <w:ilvl w:val="0"/>
+          <w:numId w:val="2"/>
+        </w:numPr>
+        <w:rPr>
+          <w:lang w:val="en-US"/>
+        </w:rPr>
+      </w:pPr>
+      <w:proofErr w:type="spellStart"/>
+      <w:r>
+        <w:rPr>
+          <w:lang w:val="en-US"/>
+        </w:rPr>
+        <w:t>pUMo</w:t>
+      </w:r>
+      <w:proofErr w:type="spellEnd"/>
+      <w:r>
+        <w:rPr>
+          <w:lang w:val="en-US"/>
+        </w:rPr>
+        <w:t xml:space="preserve">: </w:t>
+      </w:r>
+      <w:proofErr w:type="spellStart"/>
+      <w:r>
+        <w:rPr>
+          <w:lang w:val="en-US"/>
+        </w:rPr>
+        <w:t>mindeg</w:t>
+      </w:r>
+      <w:proofErr w:type="spellEnd"/>
+      <w:r>
+        <w:rPr>
+          <w:lang w:val="en-US"/>
+        </w:rPr>
+        <w:t xml:space="preserve"> = 3; radius = 2; girth =</w:t>
+      </w:r>
+      <w:r>
+        <w:rPr>
+          <w:lang w:val="en-US"/>
+        </w:rPr>
+        <w:t xml:space="preserve"> 3</w:t>
+      </w:r>
+    </w:p>
+    <w:p>
+      <w:pPr>
+        <w:pStyle w:val="Lijstalinea"/>
+        <w:numPr>
+          <w:ilvl w:val="1"/>
+          <w:numId w:val="2"/>
+        </w:numPr>
+        <w:rPr>
+          <w:lang w:val="en-US"/>
+        </w:rPr>
+      </w:pPr>
+      <w:r>
+        <w:rPr>
+          <w:lang w:val="en-US"/>
+        </w:rPr>
+        <w:t>edges:</w:t>
+      </w:r>
+    </w:p>
+    <w:p>
+      <w:pPr>
+        <w:pStyle w:val="Lijstalinea"/>
+        <w:numPr>
+          <w:ilvl w:val="2"/>
+          <w:numId w:val="2"/>
+        </w:numPr>
+        <w:rPr>
+          <w:lang w:val="en-US"/>
+        </w:rPr>
+      </w:pPr>
+      <w:r>
+        <w:rPr>
+          <w:lang w:val="en-US"/>
+        </w:rPr>
+        <w:t>n = 9: e = 21</w:t>
+      </w:r>
+    </w:p>
+    <w:p>
+      <w:pPr>
+        <w:pStyle w:val="Lijstalinea"/>
+        <w:numPr>
+          <w:ilvl w:val="2"/>
+          <w:numId w:val="2"/>
+        </w:numPr>
+        <w:rPr>
+          <w:lang w:val="en-US"/>
+        </w:rPr>
+      </w:pPr>
+      <w:r>
+        <w:rPr>
+          <w:lang w:val="en-US"/>
+        </w:rPr>
+        <w:t>n = 10: e = 24</w:t>
+      </w:r>
+    </w:p>
+    <w:p>
+      <w:pPr>
+        <w:pStyle w:val="Lijstalinea"/>
+        <w:numPr>
+          <w:ilvl w:val="2"/>
+          <w:numId w:val="2"/>
+        </w:numPr>
+        <w:rPr>
+          <w:lang w:val="en-US"/>
+        </w:rPr>
+      </w:pPr>
+      <w:r>
+        <w:rPr>
+          <w:lang w:val="en-US"/>
+        </w:rPr>
+        <w:t>n = 11: e = 27</w:t>
+      </w:r>
+    </w:p>
+    <w:p>
+      <w:pPr>
+        <w:pStyle w:val="Lijstalinea"/>
+        <w:numPr>
+          <w:ilvl w:val="2"/>
+          <w:numId w:val="2"/>
+        </w:numPr>
+        <w:rPr>
+          <w:lang w:val="en-US"/>
+        </w:rPr>
+      </w:pPr>
+      <w:r>
+        <w:rPr>
+          <w:lang w:val="en-US"/>
+        </w:rPr>
+        <w:t>n = 12: e = 30</w:t>
+      </w:r>
+    </w:p>
+    <w:p>
+      <w:pPr>
+        <w:pStyle w:val="Lijstalinea"/>
+        <w:numPr>
+          <w:ilvl w:val="2"/>
+          <w:numId w:val="2"/>
+        </w:numPr>
+        <w:rPr>
+          <w:lang w:val="en-US"/>
+        </w:rPr>
+      </w:pPr>
+      <w:r>
+        <w:rPr>
+          <w:lang w:val="en-US"/>
+        </w:rPr>
+        <w:t>n = 13: e = 33</w:t>
+      </w:r>
+    </w:p>
+    <w:p>
+      <w:pPr>
+        <w:pStyle w:val="Lijstalinea"/>
+        <w:numPr>
+          <w:ilvl w:val="2"/>
+          <w:numId w:val="2"/>
+        </w:numPr>
+        <w:rPr>
+          <w:lang w:val="en-US"/>
+        </w:rPr>
+      </w:pPr>
+      <w:r>
+        <w:rPr>
+          <w:lang w:val="en-US"/>
+        </w:rPr>
+        <w:t>n = 14; e = 36</w:t>
+      </w:r>
+    </w:p>
+    <w:p>
+      <w:pPr>
+        <w:pStyle w:val="Lijstalinea"/>
+        <w:numPr>
+          <w:ilvl w:val="2"/>
+          <w:numId w:val="2"/>
+        </w:numPr>
+        <w:rPr>
+          <w:lang w:val="en-US"/>
+        </w:rPr>
+      </w:pPr>
+      <w:r>
+        <w:rPr>
+          <w:lang w:val="en-US"/>
+        </w:rPr>
+        <w:t>e = 3 * n - 6</w:t>
+      </w:r>
+    </w:p>
+    <w:p>
+      <w:pPr>
+        <w:pStyle w:val="Lijstalinea"/>
+        <w:numPr>
+          <w:ilvl w:val="0"/>
+          <w:numId w:val="2"/>
+        </w:numPr>
+        <w:rPr>
+          <w:lang w:val="en-US"/>
+        </w:rPr>
+      </w:pPr>
+      <w:proofErr w:type="spellStart"/>
+      <w:r>
+        <w:rPr>
+          <w:lang w:val="en-US"/>
+        </w:rPr>
+        <w:t>pUMc</w:t>
+      </w:r>
+      <w:proofErr w:type="spellEnd"/>
+      <w:r>
+        <w:rPr>
+          <w:lang w:val="en-US"/>
+        </w:rPr>
+        <w:t xml:space="preserve">: </w:t>
+      </w:r>
+    </w:p>
+    <w:p>
+      <w:pPr>
+        <w:pStyle w:val="Lijstalinea"/>
+        <w:numPr>
+          <w:ilvl w:val="1"/>
+          <w:numId w:val="2"/>
+        </w:numPr>
+        <w:rPr>
+          <w:lang w:val="fr-FR"/>
+        </w:rPr>
+      </w:pPr>
+      <w:proofErr w:type="spellStart"/>
+      <w:r>
+        <w:rPr>
+          <w:lang w:val="fr-FR"/>
+        </w:rPr>
+        <w:t>O~eK</w:t>
+      </w:r>
+      <w:proofErr w:type="spellEnd"/>
+      <w:r>
+        <w:rPr>
+          <w:lang w:val="fr-FR"/>
+        </w:rPr>
+        <w:t>]</w:t>
+      </w:r>
+      <w:proofErr w:type="spellStart"/>
+      <w:r>
+        <w:rPr>
+          <w:lang w:val="fr-FR"/>
+        </w:rPr>
+        <w:t>f@SOuA@EBE</w:t>
+      </w:r>
+      <w:proofErr w:type="spellEnd"/>
+      <w:r>
+        <w:rPr>
+          <w:lang w:val="fr-FR"/>
+        </w:rPr>
+        <w:t>?_X?AP = 6</w:t>
+      </w:r>
+      <w:r>
+        <w:rPr>
+          <w:lang w:val="fr-FR"/>
+        </w:rPr>
+        <w:t xml:space="preserve"> </w:t>
+      </w:r>
+      <w:proofErr w:type="spellStart"/>
+      <w:r>
+        <w:rPr>
+          <w:lang w:val="fr-FR"/>
+        </w:rPr>
+        <w:t>colo</w:t>
+      </w:r>
+      <w:r>
+        <w:rPr>
+          <w:lang w:val="fr-FR"/>
+        </w:rPr>
+        <w:t>rs</w:t>
+      </w:r>
+      <w:proofErr w:type="spellEnd"/>
+    </w:p>
+    <w:p>
+      <w:pPr>
+        <w:pStyle w:val="Lijstalinea"/>
+        <w:numPr>
+          <w:ilvl w:val="2"/>
+          <w:numId w:val="2"/>
+        </w:numPr>
+        <w:rPr>
+          <w:lang w:val="en-US"/>
+        </w:rPr>
+      </w:pPr>
+      <w:r>
+        <w:rPr>
+          <w:lang w:val="en-US"/>
+        </w:rPr>
+        <w:t>Confirmed by naïve and optimized</w:t>
+      </w:r>
+    </w:p>
+    <w:p>
+      <w:pPr>
+        <w:pStyle w:val="Lijstalinea"/>
+        <w:numPr>
+          <w:ilvl w:val="1"/>
+          <w:numId w:val="2"/>
+        </w:numPr>
+        <w:rPr>
+          <w:lang w:val="en-US"/>
+        </w:rPr>
+      </w:pPr>
+      <w:r>
+        <w:rPr>
+          <w:lang w:val="en-US"/>
+        </w:rPr>
+        <w:t>P|}</w:t>
+      </w:r>
+      <w:proofErr w:type="spellStart"/>
+      <w:r>
+        <w:rPr>
+          <w:lang w:val="en-US"/>
+        </w:rPr>
+        <w:t>KKMD_MHg@RBB?__GGF@I</w:t>
+      </w:r>
+      <w:proofErr w:type="spellEnd"/>
+      <w:r>
+        <w:rPr>
+          <w:lang w:val="en-US"/>
+        </w:rPr>
+        <w:t>?</w:t>
+      </w:r>
+      <w:r>
+        <w:rPr>
+          <w:lang w:val="en-US"/>
+        </w:rPr>
+        <w:t xml:space="preserve"> = 6 colors</w:t>
+      </w:r>
+    </w:p>
+    <w:p>
+      <w:pPr>
+        <w:pStyle w:val="Lijstalinea"/>
+        <w:numPr>
+          <w:ilvl w:val="1"/>
+          <w:numId w:val="2"/>
+        </w:numPr>
+        <w:rPr>
+          <w:lang w:val="en-US"/>
+        </w:rPr>
+      </w:pPr>
+      <w:r>
+        <w:rPr>
+          <w:lang w:val="en-US"/>
+        </w:rPr>
+        <w:t>P|}</w:t>
+      </w:r>
+      <w:proofErr w:type="spellStart"/>
+      <w:r>
+        <w:rPr>
+          <w:lang w:val="en-US"/>
+        </w:rPr>
+        <w:t>KKEFqM?hABKB</w:t>
+      </w:r>
+      <w:proofErr w:type="spellEnd"/>
+      <w:r>
+        <w:rPr>
+          <w:lang w:val="en-US"/>
+        </w:rPr>
+        <w:t>?_EO?`?Ck</w:t>
+      </w:r>
+      <w:r>
+        <w:rPr>
+          <w:lang w:val="en-US"/>
+        </w:rPr>
+        <w:t xml:space="preserve"> =</w:t>
+      </w:r>
+      <w:r>
+        <w:rPr>
+          <w:lang w:val="en-US"/>
+        </w:rPr>
+        <w:t xml:space="preserve"> 6</w:t>
+      </w:r>
+      <w:r>
+        <w:rPr>
+          <w:lang w:val="en-US"/>
+        </w:rPr>
+        <w:t xml:space="preserve"> colors</w:t>
+      </w:r>
+    </w:p>
+    <w:p>
+      <w:pPr>
+        <w:pStyle w:val="Lijstalinea"/>
+        <w:numPr>
+          <w:ilvl w:val="1"/>
+          <w:numId w:val="2"/>
+        </w:numPr>
+        <w:rPr>
+          <w:lang w:val="en-US"/>
+        </w:rPr>
+      </w:pPr>
+      <w:proofErr w:type="spellStart"/>
+      <w:r>
+        <w:rPr>
+          <w:lang w:val="en-US"/>
+        </w:rPr>
+        <w:t>P~eKK^PoI`ADEWE?_KO</w:t>
+      </w:r>
+      <w:proofErr w:type="spellEnd"/>
+      <w:r>
+        <w:rPr>
+          <w:lang w:val="en-US"/>
+        </w:rPr>
+        <w:t>@@?Gk = 6 colors</w:t>
+      </w:r>
+    </w:p>
+    <w:p>
+      <w:pPr>
+        <w:pStyle w:val="Lijstalinea"/>
+        <w:numPr>
+          <w:ilvl w:val="1"/>
+          <w:numId w:val="2"/>
+        </w:numPr>
+        <w:rPr>
+          <w:lang w:val="en-US"/>
+        </w:rPr>
+      </w:pPr>
+      <w:proofErr w:type="spellStart"/>
+      <w:r>
+        <w:rPr>
+          <w:lang w:val="en-US"/>
+        </w:rPr>
+        <w:t>P~eK</w:t>
+      </w:r>
+      <w:proofErr w:type="spellEnd"/>
+      <w:r>
+        <w:rPr>
+          <w:lang w:val="en-US"/>
+        </w:rPr>
+        <w:t>[</w:t>
+      </w:r>
+      <w:proofErr w:type="spellStart"/>
+      <w:r>
+        <w:rPr>
+          <w:lang w:val="en-US"/>
+        </w:rPr>
+        <w:t>VPSGrA@EBE</w:t>
+      </w:r>
+      <w:proofErr w:type="spellEnd"/>
+      <w:r>
+        <w:rPr>
+          <w:lang w:val="en-US"/>
+        </w:rPr>
+        <w:t>?`@OBO?IC</w:t>
+      </w:r>
+    </w:p>
+    <w:p>
+      <w:pPr>
+        <w:pStyle w:val="Lijstalinea"/>
+        <w:numPr>
+          <w:ilvl w:val="1"/>
+          <w:numId w:val="2"/>
+        </w:numPr>
+        <w:rPr>
+          <w:lang w:val="en-US"/>
+        </w:rPr>
+      </w:pPr>
+      <w:proofErr w:type="spellStart"/>
+      <w:r>
+        <w:rPr>
+          <w:lang w:val="en-US"/>
+        </w:rPr>
+        <w:t>P~eMYD@Uz_E@CCECb?GOaACC</w:t>
+      </w:r>
+      <w:proofErr w:type="spellEnd"/>
+    </w:p>
+    <w:p>
+      <w:pPr>
+        <w:pStyle w:val="Lijstalinea"/>
+        <w:numPr>
+          <w:ilvl w:val="1"/>
+          <w:numId w:val="2"/>
+        </w:numPr>
+        <w:rPr>
+          <w:lang w:val="en-US"/>
+        </w:rPr>
+      </w:pPr>
+      <w:proofErr w:type="spellStart"/>
+      <w:r>
+        <w:rPr>
+          <w:lang w:val="en-US"/>
+        </w:rPr>
+        <w:t>P~eKM</w:t>
+      </w:r>
+      <w:proofErr w:type="spellEnd"/>
+      <w:r>
+        <w:rPr>
+          <w:lang w:val="en-US"/>
+        </w:rPr>
+        <w:t>\@OY?g@UVE?`?WY??S_</w:t>
+      </w:r>
+    </w:p>
+    <w:p>
+      <w:pPr>
+        <w:pStyle w:val="Lijstalinea"/>
+        <w:numPr>
+          <w:ilvl w:val="1"/>
+          <w:numId w:val="2"/>
+        </w:numPr>
+        <w:rPr>
+          <w:lang w:val="en-US"/>
+        </w:rPr>
+      </w:pPr>
+      <w:proofErr w:type="spellStart"/>
+      <w:r>
+        <w:rPr>
+          <w:lang w:val="en-US"/>
+        </w:rPr>
+        <w:t>P~eMYD@Uz_AAEDE?`AOO`?s</w:t>
+      </w:r>
+      <w:proofErr w:type="spellEnd"/>
+      <w:r>
+        <w:rPr>
+          <w:lang w:val="en-US"/>
+        </w:rPr>
+        <w:t>?</w:t>
+      </w:r>
+    </w:p>
+    <w:p>
+      <w:pPr>
+        <w:pStyle w:val="Lijstalinea"/>
+        <w:numPr>
+          <w:ilvl w:val="1"/>
+          <w:numId w:val="2"/>
+        </w:numPr>
+        <w:rPr>
+          <w:lang w:val="en-US"/>
+        </w:rPr>
+      </w:pPr>
+      <w:proofErr w:type="spellStart"/>
+      <w:r>
+        <w:rPr>
+          <w:lang w:val="en-US"/>
+        </w:rPr>
+        <w:t>P~eMYD@Uz_AAEDE?`AOO</w:t>
+      </w:r>
+      <w:proofErr w:type="spellEnd"/>
+      <w:r>
+        <w:rPr>
+          <w:lang w:val="en-US"/>
+        </w:rPr>
+        <w:t>`?[?</w:t>
+      </w:r>
+    </w:p>
+    <w:p>
+      <w:pPr>
+        <w:pStyle w:val="Lijstalinea"/>
+        <w:numPr>
+          <w:ilvl w:val="1"/>
+          <w:numId w:val="2"/>
+        </w:numPr>
+        <w:rPr>
+          <w:lang w:val="en-US"/>
+        </w:rPr>
+      </w:pPr>
+      <w:proofErr w:type="spellStart"/>
+      <w:r>
+        <w:rPr>
+          <w:lang w:val="en-US"/>
+        </w:rPr>
+        <w:t>P|eL</w:t>
+      </w:r>
+      <w:proofErr w:type="spellEnd"/>
+      <w:r>
+        <w:rPr>
+          <w:lang w:val="en-US"/>
+        </w:rPr>
+        <w:t>}</w:t>
+      </w:r>
+      <w:proofErr w:type="spellStart"/>
+      <w:r>
+        <w:rPr>
+          <w:lang w:val="en-US"/>
+        </w:rPr>
+        <w:t>F@Wr?cBK</w:t>
+      </w:r>
+      <w:proofErr w:type="spellEnd"/>
+      <w:r>
+        <w:rPr>
+          <w:lang w:val="en-US"/>
+        </w:rPr>
+        <w:t>_?</w:t>
+      </w:r>
+      <w:proofErr w:type="spellStart"/>
+      <w:r>
+        <w:rPr>
+          <w:lang w:val="en-US"/>
+        </w:rPr>
+        <w:t>c?YGE</w:t>
+      </w:r>
+      <w:proofErr w:type="spellEnd"/>
+      <w:r>
+        <w:rPr>
+          <w:lang w:val="en-US"/>
+        </w:rPr>
+        <w:t>@?SG</w:t>
+      </w:r>
+    </w:p>
+    <w:p>
+      <w:pPr>
+        <w:pStyle w:val="Lijstalinea"/>
+        <w:numPr>
+          <w:ilvl w:val="1"/>
+          <w:numId w:val="2"/>
+        </w:numPr>
+        <w:rPr>
+          <w:lang w:val="en-US"/>
+        </w:rPr>
+      </w:pPr>
+      <w:r>
+        <w:rPr>
+          <w:lang w:val="en-US"/>
+        </w:rPr>
+        <w:t>P|}KML@OIZ`@ABBA`_</w:t>
+      </w:r>
+      <w:proofErr w:type="spellStart"/>
+      <w:r>
+        <w:rPr>
+          <w:lang w:val="en-US"/>
+        </w:rPr>
+        <w:t>GGQ@o</w:t>
+      </w:r>
+      <w:proofErr w:type="spellEnd"/>
+      <w:r>
+        <w:rPr>
+          <w:lang w:val="en-US"/>
+        </w:rPr>
+        <w:t>?</w:t>
+      </w:r>
+    </w:p>
+    <w:p>
+      <w:pPr>
+        <w:pStyle w:val="Lijstalinea"/>
+        <w:numPr>
+          <w:ilvl w:val="1"/>
+          <w:numId w:val="2"/>
+        </w:numPr>
+        <w:rPr>
+          <w:lang w:val="en-US"/>
+        </w:rPr>
+      </w:pPr>
+      <w:proofErr w:type="spellStart"/>
+      <w:r>
+        <w:rPr>
+          <w:lang w:val="en-US"/>
+        </w:rPr>
+        <w:t>P~f</w:t>
+      </w:r>
+      <w:proofErr w:type="spellEnd"/>
+      <w:r>
+        <w:rPr>
+          <w:lang w:val="en-US"/>
+        </w:rPr>
+        <w:t>[</w:t>
+      </w:r>
+      <w:proofErr w:type="spellStart"/>
+      <w:r>
+        <w:rPr>
+          <w:lang w:val="en-US"/>
+        </w:rPr>
+        <w:t>KFBOI?gvP?T</w:t>
+      </w:r>
+      <w:proofErr w:type="spellEnd"/>
+      <w:r>
+        <w:rPr>
+          <w:lang w:val="en-US"/>
+        </w:rPr>
+        <w:t>?___G@@`K</w:t>
+      </w:r>
+    </w:p>
+    <w:p>
+      <w:pPr>
+        <w:pStyle w:val="Lijstalinea"/>
+        <w:numPr>
+          <w:ilvl w:val="1"/>
+          <w:numId w:val="2"/>
+        </w:numPr>
+        <w:rPr>
+          <w:lang w:val="en-US"/>
+        </w:rPr>
+      </w:pPr>
+      <w:proofErr w:type="spellStart"/>
+      <w:r>
+        <w:rPr>
+          <w:lang w:val="en-US"/>
+        </w:rPr>
+        <w:t>P~eK</w:t>
+      </w:r>
+      <w:proofErr w:type="spellEnd"/>
+      <w:r>
+        <w:rPr>
+          <w:lang w:val="en-US"/>
+        </w:rPr>
+        <w:t>]</w:t>
+      </w:r>
+      <w:proofErr w:type="spellStart"/>
+      <w:r>
+        <w:rPr>
+          <w:lang w:val="en-US"/>
+        </w:rPr>
+        <w:t>f@SOabWC@E@b?GEG?PC</w:t>
+      </w:r>
+      <w:proofErr w:type="spellEnd"/>
+    </w:p>
+    <w:p>
+      <w:pPr>
+        <w:pStyle w:val="Lijstalinea"/>
+        <w:numPr>
+          <w:ilvl w:val="1"/>
+          <w:numId w:val="2"/>
+        </w:numPr>
+        <w:rPr>
+          <w:lang w:val="en-US"/>
+        </w:rPr>
+      </w:pPr>
+      <w:proofErr w:type="spellStart"/>
+      <w:r>
+        <w:rPr>
+          <w:lang w:val="en-US"/>
+        </w:rPr>
+        <w:t>P~uKML@OY?hjQ?U</w:t>
+      </w:r>
+      <w:proofErr w:type="spellEnd"/>
+      <w:r>
+        <w:rPr>
+          <w:lang w:val="en-US"/>
+        </w:rPr>
+        <w:t>?`?_WH?T?</w:t>
+      </w:r>
+    </w:p>
+    <w:p>
+      <w:pPr>
+        <w:pStyle w:val="Lijstalinea"/>
+        <w:numPr>
+          <w:ilvl w:val="1"/>
+          <w:numId w:val="2"/>
+        </w:numPr>
+        <w:rPr>
+          <w:lang w:val="en-US"/>
+        </w:rPr>
+      </w:pPr>
+      <w:proofErr w:type="spellStart"/>
+      <w:r>
+        <w:rPr>
+          <w:lang w:val="en-US"/>
+        </w:rPr>
+        <w:t>P|nMJX@WZ?cII?M</w:t>
+      </w:r>
+      <w:proofErr w:type="spellEnd"/>
+      <w:r>
+        <w:rPr>
+          <w:lang w:val="en-US"/>
+        </w:rPr>
+        <w:t>?`G?Y@@OC</w:t>
+      </w:r>
+    </w:p>
+    <w:p>
+      <w:pPr>
+        <w:pStyle w:val="Lijstalinea"/>
+        <w:numPr>
+          <w:ilvl w:val="1"/>
+          <w:numId w:val="2"/>
+        </w:numPr>
+        <w:rPr>
+          <w:lang w:val="en-US"/>
+        </w:rPr>
+      </w:pPr>
+      <w:proofErr w:type="spellStart"/>
+      <w:r>
+        <w:rPr>
+          <w:lang w:val="en-US"/>
+        </w:rPr>
+        <w:t>P~eK</w:t>
+      </w:r>
+      <w:proofErr w:type="spellEnd"/>
+      <w:r>
+        <w:rPr>
+          <w:lang w:val="en-US"/>
+        </w:rPr>
+        <w:t>]</w:t>
+      </w:r>
+      <w:proofErr w:type="spellStart"/>
+      <w:r>
+        <w:rPr>
+          <w:lang w:val="en-US"/>
+        </w:rPr>
+        <w:t>f@SOuA@EBE</w:t>
+      </w:r>
+      <w:proofErr w:type="spellEnd"/>
+      <w:r>
+        <w:rPr>
+          <w:lang w:val="en-US"/>
+        </w:rPr>
+        <w:t>?_X?E@?QG</w:t>
+      </w:r>
+    </w:p>
+    <w:p>
+      <w:pPr>
+        <w:pStyle w:val="Lijstalinea"/>
+        <w:numPr>
+          <w:ilvl w:val="1"/>
+          <w:numId w:val="2"/>
+        </w:numPr>
+        <w:rPr>
+          <w:lang w:val="en-US"/>
+        </w:rPr>
+      </w:pPr>
+      <w:proofErr w:type="spellStart"/>
+      <w:r>
+        <w:rPr>
+          <w:lang w:val="en-US"/>
+        </w:rPr>
+        <w:t>P|nMILkOJ@k@GIAG@cGW</w:t>
+      </w:r>
+      <w:proofErr w:type="spellEnd"/>
+      <w:r>
+        <w:rPr>
+          <w:lang w:val="en-US"/>
+        </w:rPr>
+        <w:t>@@GG</w:t>
+      </w:r>
+    </w:p>
+    <w:p>
+      <w:pPr>
+        <w:pStyle w:val="Lijstalinea"/>
+        <w:numPr>
+          <w:ilvl w:val="0"/>
+          <w:numId w:val="2"/>
+        </w:numPr>
+      </w:pPr>
+      <w:proofErr w:type="spellStart"/>
+      <w:r>
+        <w:t>iUMo</w:t>
+      </w:r>
+      <w:proofErr w:type="spellEnd"/>
+      <w:r>
+        <w:t>: komt niet dicht bij 6</w:t>
+      </w:r>
+      <w:r>
+        <w:t xml:space="preserve"> (max. 4) (tot 1</w:t>
+      </w:r>
+      <w:r>
+        <w:t>4</w:t>
+      </w:r>
+      <w:r>
+        <w:t xml:space="preserve"> n</w:t>
+      </w:r>
+      <w:r>
+        <w:t xml:space="preserve"> gecheckt</w:t>
+      </w:r>
+      <w:r>
+        <w:t>)</w:t>
+      </w:r>
+    </w:p>
+    <w:p>
+      <w:pPr>
+        <w:pStyle w:val="Lijstalinea"/>
+        <w:numPr>
+          <w:ilvl w:val="0"/>
+          <w:numId w:val="2"/>
+        </w:numPr>
+      </w:pPr>
+      <w:proofErr w:type="spellStart"/>
+      <w:r>
+        <w:t>iUMc</w:t>
+      </w:r>
+      <w:proofErr w:type="spellEnd"/>
+      <w:r>
+        <w:t xml:space="preserve">: komt max. bij 3 voor meeste </w:t>
+      </w:r>
+      <w:proofErr w:type="spellStart"/>
+      <w:r>
+        <w:t>grafen</w:t>
+      </w:r>
+      <w:proofErr w:type="spellEnd"/>
+      <w:r>
+        <w:t>: nog te onderzoeken (lager dan 4)</w:t>
+      </w:r>
+    </w:p>
+    <w:p>
+      <w:pPr>
+        <w:pStyle w:val="Lijstalinea"/>
+        <w:numPr>
+          <w:ilvl w:val="0"/>
+          <w:numId w:val="2"/>
+        </w:numPr>
+      </w:pPr>
+      <w:proofErr w:type="spellStart"/>
+      <w:r>
+        <w:t>pCFo</w:t>
+      </w:r>
+      <w:proofErr w:type="spellEnd"/>
+      <w:r>
+        <w:t>: komt max. bij 5, lager dan 6</w:t>
+      </w:r>
+    </w:p>
+    <w:p>
+      <w:pPr>
+        <w:pStyle w:val="Lijstalinea"/>
+        <w:numPr>
+          <w:ilvl w:val="0"/>
+          <w:numId w:val="2"/>
+        </w:numPr>
+      </w:pPr>
+      <w:proofErr w:type="spellStart"/>
+      <w:r>
+        <w:t>pCFc</w:t>
+      </w:r>
+      <w:proofErr w:type="spellEnd"/>
+      <w:r>
+        <w:t xml:space="preserve"> = proper</w:t>
+      </w:r>
+    </w:p>
+    <w:p>
+      <w:pPr>
+        <w:pStyle w:val="Lijstalinea"/>
+        <w:numPr>
+          <w:ilvl w:val="0"/>
+          <w:numId w:val="2"/>
+        </w:numPr>
+      </w:pPr>
+      <w:proofErr w:type="spellStart"/>
+      <w:r>
+        <w:t>iCFo</w:t>
+      </w:r>
+      <w:proofErr w:type="spellEnd"/>
+      <w:r>
+        <w:t xml:space="preserve">: bijna alle </w:t>
+      </w:r>
+      <w:proofErr w:type="spellStart"/>
+      <w:r>
+        <w:t>grafen</w:t>
+      </w:r>
+      <w:proofErr w:type="spellEnd"/>
+      <w:r>
+        <w:t xml:space="preserve"> &lt; 14 = 3: lager dan 4</w:t>
+      </w:r>
+    </w:p>
+    <w:p>
+      <w:pPr>
+        <w:pStyle w:val="Lijstalinea"/>
+        <w:numPr>
+          <w:ilvl w:val="0"/>
+          <w:numId w:val="2"/>
+        </w:numPr>
+      </w:pPr>
+      <w:proofErr w:type="spellStart"/>
+      <w:r>
+        <w:t>iCFc</w:t>
+      </w:r>
+      <w:proofErr w:type="spellEnd"/>
+      <w:r>
+        <w:t xml:space="preserve">: meeste </w:t>
+      </w:r>
+      <w:proofErr w:type="spellStart"/>
+      <w:r>
+        <w:t>grafen</w:t>
+      </w:r>
+      <w:proofErr w:type="spellEnd"/>
+      <w:r>
+        <w:t xml:space="preserve"> = 3: nog te onderzoeken</w:t>
+      </w:r>
+    </w:p>
+    <w:p>
+      <w:pPr>
+        <w:pStyle w:val="Lijstalinea"/>
+        <w:numPr>
+          <w:ilvl w:val="0"/>
+          <w:numId w:val="2"/>
+        </w:numPr>
+      </w:pPr>
+      <w:proofErr w:type="spellStart"/>
+      <w:r>
+        <w:t>odd</w:t>
+      </w:r>
+      <w:proofErr w:type="spellEnd"/>
+      <w:r>
+        <w:t>:</w:t>
+      </w:r>
+      <w:r>
+        <w:t xml:space="preserve"> veel </w:t>
+      </w:r>
+      <w:proofErr w:type="spellStart"/>
+      <w:r>
+        <w:t>grafen</w:t>
+      </w:r>
+      <w:proofErr w:type="spellEnd"/>
+      <w:r>
+        <w:t xml:space="preserve"> met = 5: nog te onderzoeken.</w:t>
       </w:r>
     </w:p>
     <w:sectPr>
@@ -119,7 +1119,7 @@
         <w:rFonts w:ascii="Aptos" w:eastAsiaTheme="minorHAnsi" w:hAnsi="Aptos" w:cstheme="minorBidi" w:hint="default"/>
       </w:rPr>
     </w:lvl>
-    <w:lvl w:ilvl="1" w:tplc="08130003" w:tentative="1">
+    <w:lvl w:ilvl="1" w:tplc="08130003">
       <w:start w:val="1"/>
       <w:numFmt w:val="bullet"/>
       <w:lvlText w:val="o"/>
@@ -131,7 +1131,7 @@
         <w:rFonts w:ascii="Courier New" w:hAnsi="Courier New" w:cs="Courier New" w:hint="default"/>
       </w:rPr>
     </w:lvl>
-    <w:lvl w:ilvl="2" w:tplc="08130005" w:tentative="1">
+    <w:lvl w:ilvl="2" w:tplc="08130005">
       <w:start w:val="1"/>
       <w:numFmt w:val="bullet"/>
       <w:lvlText w:val=""/>

</xml_diff>